<commit_message>
fix(be): update in template bestaetigungen slugs, update year format and add calculated_float to subsection
</commit_message>
<xml_diff>
--- a/document-merge-service/kt_bern/templatefiles/audit-form.docx
+++ b/document-merge-service/kt_bern/templatefiles/audit-form.docx
@@ -10,7 +10,7 @@
         <w:suppressAutoHyphens w:val="true"/>
         <w:bidi w:val="0"/>
         <w:spacing w:before="240" w:after="1440"/>
-        <w:ind w:left="4229" w:right="0" w:hanging="0"/>
+        <w:ind w:hanging="0" w:left="4229" w:right="0"/>
         <w:jc w:val="left"/>
         <w:rPr/>
       </w:pPr>
@@ -113,15 +113,15 @@
         </w:tblCellMar>
       </w:tblPr>
       <w:tblGrid>
-        <w:gridCol w:w="3869"/>
-        <w:gridCol w:w="274"/>
+        <w:gridCol w:w="3868"/>
+        <w:gridCol w:w="275"/>
         <w:gridCol w:w="4786"/>
       </w:tblGrid>
       <w:tr>
         <w:trPr/>
         <w:tc>
           <w:tcPr>
-            <w:tcW w:w="3869" w:type="dxa"/>
+            <w:tcW w:w="3868" w:type="dxa"/>
             <w:tcBorders/>
           </w:tcPr>
           <w:p>
@@ -134,7 +134,7 @@
               </w:numPr>
               <w:suppressAutoHyphens w:val="true"/>
               <w:spacing w:before="0" w:after="0"/>
-              <w:ind w:right="176" w:hanging="0"/>
+              <w:ind w:hanging="0" w:right="176"/>
               <w:rPr/>
             </w:pPr>
             <w:r>
@@ -150,7 +150,7 @@
         </w:tc>
         <w:tc>
           <w:tcPr>
-            <w:tcW w:w="274" w:type="dxa"/>
+            <w:tcW w:w="275" w:type="dxa"/>
             <w:tcBorders/>
           </w:tcPr>
           <w:p>
@@ -163,7 +163,7 @@
               </w:numPr>
               <w:suppressAutoHyphens w:val="true"/>
               <w:spacing w:before="0" w:after="0"/>
-              <w:ind w:right="176" w:hanging="0"/>
+              <w:ind w:hanging="0" w:right="176"/>
               <w:rPr/>
             </w:pPr>
             <w:r>
@@ -186,7 +186,7 @@
               </w:numPr>
               <w:suppressAutoHyphens w:val="true"/>
               <w:spacing w:before="0" w:after="0"/>
-              <w:ind w:right="176" w:hanging="0"/>
+              <w:ind w:hanging="0" w:right="176"/>
               <w:rPr/>
             </w:pPr>
             <w:r>
@@ -205,7 +205,7 @@
         <w:trPr/>
         <w:tc>
           <w:tcPr>
-            <w:tcW w:w="3869" w:type="dxa"/>
+            <w:tcW w:w="3868" w:type="dxa"/>
             <w:tcBorders/>
           </w:tcPr>
           <w:p>
@@ -214,7 +214,6 @@
               <w:widowControl w:val="false"/>
               <w:rPr>
                 <w:rFonts w:ascii="Liberation Sans" w:hAnsi="Liberation Sans" w:eastAsia="Noto Sans CJK SC Regular" w:cs="Arial"/>
-                <w:b w:val="false"/>
                 <w:b w:val="false"/>
                 <w:bCs w:val="false"/>
                 <w:color w:val="auto"/>
@@ -241,7 +240,7 @@
         </w:tc>
         <w:tc>
           <w:tcPr>
-            <w:tcW w:w="274" w:type="dxa"/>
+            <w:tcW w:w="275" w:type="dxa"/>
             <w:tcBorders/>
           </w:tcPr>
           <w:p>
@@ -250,7 +249,6 @@
               <w:widowControl w:val="false"/>
               <w:rPr>
                 <w:rFonts w:ascii="Liberation Sans" w:hAnsi="Liberation Sans" w:eastAsia="Noto Sans CJK SC Regular" w:cs="Arial"/>
-                <w:b w:val="false"/>
                 <w:b w:val="false"/>
                 <w:bCs w:val="false"/>
                 <w:color w:val="auto"/>
@@ -286,7 +284,6 @@
               <w:rPr>
                 <w:rFonts w:ascii="Liberation Sans" w:hAnsi="Liberation Sans" w:eastAsia="Noto Sans CJK SC Regular" w:cs="Arial"/>
                 <w:b w:val="false"/>
-                <w:b w:val="false"/>
                 <w:bCs w:val="false"/>
                 <w:color w:val="auto"/>
                 <w:kern w:val="2"/>
@@ -315,7 +312,7 @@
         <w:trPr/>
         <w:tc>
           <w:tcPr>
-            <w:tcW w:w="3869" w:type="dxa"/>
+            <w:tcW w:w="3868" w:type="dxa"/>
             <w:tcBorders/>
           </w:tcPr>
           <w:p>
@@ -324,7 +321,6 @@
               <w:widowControl w:val="false"/>
               <w:rPr>
                 <w:rFonts w:ascii="Liberation Sans" w:hAnsi="Liberation Sans" w:eastAsia="Noto Sans CJK SC Regular" w:cs="Arial"/>
-                <w:b w:val="false"/>
                 <w:b w:val="false"/>
                 <w:bCs w:val="false"/>
                 <w:color w:val="auto"/>
@@ -350,7 +346,7 @@
         </w:tc>
         <w:tc>
           <w:tcPr>
-            <w:tcW w:w="274" w:type="dxa"/>
+            <w:tcW w:w="275" w:type="dxa"/>
             <w:tcBorders/>
           </w:tcPr>
           <w:p>
@@ -359,7 +355,6 @@
               <w:widowControl w:val="false"/>
               <w:rPr>
                 <w:rFonts w:ascii="Liberation Sans" w:hAnsi="Liberation Sans" w:eastAsia="Noto Sans CJK SC Regular" w:cs="Arial"/>
-                <w:b w:val="false"/>
                 <w:b w:val="false"/>
                 <w:bCs w:val="false"/>
                 <w:color w:val="auto"/>
@@ -404,7 +399,7 @@
         <w:trPr/>
         <w:tc>
           <w:tcPr>
-            <w:tcW w:w="3869" w:type="dxa"/>
+            <w:tcW w:w="3868" w:type="dxa"/>
             <w:tcBorders/>
           </w:tcPr>
           <w:p>
@@ -417,10 +412,9 @@
               </w:numPr>
               <w:suppressAutoHyphens w:val="true"/>
               <w:spacing w:before="0" w:after="0"/>
-              <w:ind w:right="176" w:hanging="0"/>
+              <w:ind w:hanging="0" w:right="176"/>
               <w:rPr>
                 <w:rFonts w:ascii="Liberation Sans" w:hAnsi="Liberation Sans" w:eastAsia="Noto Sans CJK SC Regular" w:cs="Arial"/>
-                <w:b/>
                 <w:b/>
                 <w:bCs/>
                 <w:color w:val="auto"/>
@@ -447,7 +441,7 @@
         </w:tc>
         <w:tc>
           <w:tcPr>
-            <w:tcW w:w="274" w:type="dxa"/>
+            <w:tcW w:w="275" w:type="dxa"/>
             <w:tcBorders/>
           </w:tcPr>
           <w:p>
@@ -460,7 +454,7 @@
               </w:numPr>
               <w:suppressAutoHyphens w:val="true"/>
               <w:spacing w:before="0" w:after="0"/>
-              <w:ind w:right="176" w:hanging="0"/>
+              <w:ind w:hanging="0" w:right="176"/>
               <w:rPr/>
             </w:pPr>
             <w:r>
@@ -483,10 +477,9 @@
               </w:numPr>
               <w:suppressAutoHyphens w:val="true"/>
               <w:spacing w:before="0" w:after="0"/>
-              <w:ind w:right="176" w:hanging="0"/>
+              <w:ind w:hanging="0" w:right="176"/>
               <w:rPr>
                 <w:rFonts w:ascii="Liberation Sans" w:hAnsi="Liberation Sans" w:eastAsia="Noto Sans CJK SC Regular" w:cs="Arial"/>
-                <w:b/>
                 <w:b/>
                 <w:bCs/>
                 <w:color w:val="auto"/>
@@ -516,7 +509,7 @@
         <w:trPr/>
         <w:tc>
           <w:tcPr>
-            <w:tcW w:w="3869" w:type="dxa"/>
+            <w:tcW w:w="3868" w:type="dxa"/>
             <w:tcBorders/>
           </w:tcPr>
           <w:p>
@@ -525,7 +518,6 @@
               <w:widowControl w:val="false"/>
               <w:rPr>
                 <w:rFonts w:ascii="Liberation Sans" w:hAnsi="Liberation Sans" w:eastAsia="Noto Sans CJK SC Regular" w:cs="Arial"/>
-                <w:b w:val="false"/>
                 <w:b w:val="false"/>
                 <w:bCs w:val="false"/>
                 <w:color w:val="auto"/>
@@ -552,7 +544,7 @@
         </w:tc>
         <w:tc>
           <w:tcPr>
-            <w:tcW w:w="274" w:type="dxa"/>
+            <w:tcW w:w="275" w:type="dxa"/>
             <w:tcBorders/>
           </w:tcPr>
           <w:p>
@@ -565,9 +557,8 @@
               </w:numPr>
               <w:suppressAutoHyphens w:val="true"/>
               <w:spacing w:before="0" w:after="0"/>
-              <w:ind w:right="176" w:hanging="0"/>
-              <w:rPr>
-                <w:b w:val="false"/>
+              <w:ind w:hanging="0" w:right="176"/>
+              <w:rPr>
                 <w:b w:val="false"/>
                 <w:bCs w:val="false"/>
               </w:rPr>
@@ -592,7 +583,6 @@
               <w:rPr>
                 <w:rFonts w:ascii="Liberation Sans" w:hAnsi="Liberation Sans" w:eastAsia="Noto Sans CJK SC Regular" w:cs="Arial"/>
                 <w:b w:val="false"/>
-                <w:b w:val="false"/>
                 <w:bCs w:val="false"/>
                 <w:color w:val="auto"/>
                 <w:kern w:val="2"/>
@@ -621,7 +611,7 @@
         <w:trPr/>
         <w:tc>
           <w:tcPr>
-            <w:tcW w:w="3869" w:type="dxa"/>
+            <w:tcW w:w="3868" w:type="dxa"/>
             <w:tcBorders/>
           </w:tcPr>
           <w:p>
@@ -634,9 +624,8 @@
               </w:numPr>
               <w:suppressAutoHyphens w:val="true"/>
               <w:spacing w:before="0" w:after="0"/>
-              <w:ind w:right="176" w:hanging="0"/>
-              <w:rPr>
-                <w:b w:val="false"/>
+              <w:ind w:hanging="0" w:right="176"/>
+              <w:rPr>
                 <w:b w:val="false"/>
                 <w:bCs w:val="false"/>
               </w:rPr>
@@ -651,7 +640,7 @@
         </w:tc>
         <w:tc>
           <w:tcPr>
-            <w:tcW w:w="274" w:type="dxa"/>
+            <w:tcW w:w="275" w:type="dxa"/>
             <w:tcBorders/>
           </w:tcPr>
           <w:p>
@@ -664,9 +653,8 @@
               </w:numPr>
               <w:suppressAutoHyphens w:val="true"/>
               <w:spacing w:before="0" w:after="0"/>
-              <w:ind w:right="176" w:hanging="0"/>
-              <w:rPr>
-                <w:b w:val="false"/>
+              <w:ind w:hanging="0" w:right="176"/>
+              <w:rPr>
                 <w:b w:val="false"/>
                 <w:bCs w:val="false"/>
               </w:rPr>
@@ -694,7 +682,7 @@
               </w:numPr>
               <w:suppressAutoHyphens w:val="true"/>
               <w:spacing w:before="0" w:after="0"/>
-              <w:ind w:right="176" w:hanging="0"/>
+              <w:ind w:hanging="0" w:right="176"/>
               <w:rPr/>
             </w:pPr>
             <w:r>
@@ -707,7 +695,7 @@
         <w:trPr/>
         <w:tc>
           <w:tcPr>
-            <w:tcW w:w="3869" w:type="dxa"/>
+            <w:tcW w:w="3868" w:type="dxa"/>
             <w:tcBorders/>
           </w:tcPr>
           <w:p>
@@ -720,7 +708,7 @@
               </w:numPr>
               <w:suppressAutoHyphens w:val="true"/>
               <w:spacing w:before="0" w:after="0"/>
-              <w:ind w:right="176" w:hanging="0"/>
+              <w:ind w:hanging="0" w:right="176"/>
               <w:rPr/>
             </w:pPr>
             <w:r>
@@ -736,7 +724,7 @@
         </w:tc>
         <w:tc>
           <w:tcPr>
-            <w:tcW w:w="274" w:type="dxa"/>
+            <w:tcW w:w="275" w:type="dxa"/>
             <w:tcBorders/>
           </w:tcPr>
           <w:p>
@@ -749,9 +737,8 @@
               </w:numPr>
               <w:suppressAutoHyphens w:val="true"/>
               <w:spacing w:before="0" w:after="0"/>
-              <w:ind w:right="176" w:hanging="0"/>
-              <w:rPr>
-                <w:b w:val="false"/>
+              <w:ind w:hanging="0" w:right="176"/>
+              <w:rPr>
                 <w:b w:val="false"/>
                 <w:bCs w:val="false"/>
               </w:rPr>
@@ -779,7 +766,7 @@
               </w:numPr>
               <w:suppressAutoHyphens w:val="true"/>
               <w:spacing w:before="0" w:after="0"/>
-              <w:ind w:right="176" w:hanging="0"/>
+              <w:ind w:hanging="0" w:right="176"/>
               <w:rPr/>
             </w:pPr>
             <w:r>
@@ -798,7 +785,7 @@
         <w:trPr/>
         <w:tc>
           <w:tcPr>
-            <w:tcW w:w="3869" w:type="dxa"/>
+            <w:tcW w:w="3868" w:type="dxa"/>
             <w:tcBorders/>
           </w:tcPr>
           <w:p>
@@ -811,9 +798,8 @@
               </w:numPr>
               <w:suppressAutoHyphens w:val="true"/>
               <w:spacing w:before="0" w:after="0"/>
-              <w:ind w:right="176" w:hanging="0"/>
-              <w:rPr>
-                <w:b w:val="false"/>
+              <w:ind w:hanging="0" w:right="176"/>
+              <w:rPr>
                 <w:b w:val="false"/>
                 <w:bCs w:val="false"/>
               </w:rPr>
@@ -859,7 +845,7 @@
         </w:tc>
         <w:tc>
           <w:tcPr>
-            <w:tcW w:w="274" w:type="dxa"/>
+            <w:tcW w:w="275" w:type="dxa"/>
             <w:tcBorders/>
           </w:tcPr>
           <w:p>
@@ -872,9 +858,8 @@
               </w:numPr>
               <w:suppressAutoHyphens w:val="true"/>
               <w:spacing w:before="0" w:after="0"/>
-              <w:ind w:right="176" w:hanging="0"/>
-              <w:rPr>
-                <w:b w:val="false"/>
+              <w:ind w:hanging="0" w:right="176"/>
+              <w:rPr>
                 <w:b w:val="false"/>
                 <w:bCs w:val="false"/>
               </w:rPr>
@@ -902,10 +887,9 @@
               </w:numPr>
               <w:suppressAutoHyphens w:val="true"/>
               <w:spacing w:before="0" w:after="0"/>
-              <w:ind w:right="176" w:hanging="0"/>
+              <w:ind w:hanging="0" w:right="176"/>
               <w:rPr>
                 <w:rFonts w:ascii="Liberation Sans" w:hAnsi="Liberation Sans" w:eastAsia="Noto Sans CJK SC Regular" w:cs="Arial"/>
-                <w:b w:val="false"/>
                 <w:b w:val="false"/>
                 <w:bCs w:val="false"/>
                 <w:color w:val="auto"/>
@@ -935,7 +919,7 @@
         <w:trPr/>
         <w:tc>
           <w:tcPr>
-            <w:tcW w:w="3869" w:type="dxa"/>
+            <w:tcW w:w="3868" w:type="dxa"/>
             <w:tcBorders/>
           </w:tcPr>
           <w:p>
@@ -948,9 +932,8 @@
               </w:numPr>
               <w:suppressAutoHyphens w:val="true"/>
               <w:spacing w:before="0" w:after="0"/>
-              <w:ind w:right="176" w:hanging="0"/>
-              <w:rPr>
-                <w:b w:val="false"/>
+              <w:ind w:hanging="0" w:right="176"/>
+              <w:rPr>
                 <w:b w:val="false"/>
                 <w:bCs w:val="false"/>
               </w:rPr>
@@ -965,7 +948,7 @@
         </w:tc>
         <w:tc>
           <w:tcPr>
-            <w:tcW w:w="274" w:type="dxa"/>
+            <w:tcW w:w="275" w:type="dxa"/>
             <w:tcBorders/>
           </w:tcPr>
           <w:p>
@@ -978,9 +961,8 @@
               </w:numPr>
               <w:suppressAutoHyphens w:val="true"/>
               <w:spacing w:before="0" w:after="0"/>
-              <w:ind w:right="176" w:hanging="0"/>
-              <w:rPr>
-                <w:b w:val="false"/>
+              <w:ind w:hanging="0" w:right="176"/>
+              <w:rPr>
                 <w:b w:val="false"/>
                 <w:bCs w:val="false"/>
               </w:rPr>
@@ -1008,7 +990,7 @@
               </w:numPr>
               <w:suppressAutoHyphens w:val="true"/>
               <w:spacing w:before="0" w:after="0"/>
-              <w:ind w:right="176" w:hanging="0"/>
+              <w:ind w:hanging="0" w:right="176"/>
               <w:rPr/>
             </w:pPr>
             <w:r>
@@ -1021,7 +1003,7 @@
         <w:trPr/>
         <w:tc>
           <w:tcPr>
-            <w:tcW w:w="3869" w:type="dxa"/>
+            <w:tcW w:w="3868" w:type="dxa"/>
             <w:tcBorders/>
           </w:tcPr>
           <w:p>
@@ -1034,10 +1016,9 @@
               </w:numPr>
               <w:suppressAutoHyphens w:val="true"/>
               <w:spacing w:before="0" w:after="0"/>
-              <w:ind w:right="176" w:hanging="0"/>
+              <w:ind w:hanging="0" w:right="176"/>
               <w:rPr>
                 <w:rFonts w:ascii="Liberation Sans" w:hAnsi="Liberation Sans" w:eastAsia="Noto Sans CJK SC Regular" w:cs="Arial"/>
-                <w:b/>
                 <w:b/>
                 <w:bCs/>
                 <w:color w:val="auto"/>
@@ -1064,7 +1045,7 @@
         </w:tc>
         <w:tc>
           <w:tcPr>
-            <w:tcW w:w="274" w:type="dxa"/>
+            <w:tcW w:w="275" w:type="dxa"/>
             <w:tcBorders/>
           </w:tcPr>
           <w:p>
@@ -1077,9 +1058,8 @@
               </w:numPr>
               <w:suppressAutoHyphens w:val="true"/>
               <w:spacing w:before="0" w:after="0"/>
-              <w:ind w:right="176" w:hanging="0"/>
-              <w:rPr>
-                <w:b w:val="false"/>
+              <w:ind w:hanging="0" w:right="176"/>
+              <w:rPr>
                 <w:b w:val="false"/>
                 <w:bCs w:val="false"/>
               </w:rPr>
@@ -1107,7 +1087,7 @@
               </w:numPr>
               <w:suppressAutoHyphens w:val="true"/>
               <w:spacing w:before="0" w:after="0"/>
-              <w:ind w:right="176" w:hanging="0"/>
+              <w:ind w:hanging="0" w:right="176"/>
               <w:rPr/>
             </w:pPr>
             <w:r>
@@ -1126,7 +1106,7 @@
         <w:trPr/>
         <w:tc>
           <w:tcPr>
-            <w:tcW w:w="3869" w:type="dxa"/>
+            <w:tcW w:w="3868" w:type="dxa"/>
             <w:tcBorders/>
           </w:tcPr>
           <w:p>
@@ -1139,10 +1119,9 @@
               </w:numPr>
               <w:suppressAutoHyphens w:val="true"/>
               <w:spacing w:before="0" w:after="0"/>
-              <w:ind w:right="176" w:hanging="0"/>
+              <w:ind w:hanging="0" w:right="176"/>
               <w:rPr>
                 <w:rFonts w:ascii="Liberation Sans" w:hAnsi="Liberation Sans" w:eastAsia="Noto Sans CJK SC Regular" w:cs="Arial"/>
-                <w:b w:val="false"/>
                 <w:b w:val="false"/>
                 <w:bCs w:val="false"/>
                 <w:color w:val="auto"/>
@@ -1169,7 +1148,7 @@
         </w:tc>
         <w:tc>
           <w:tcPr>
-            <w:tcW w:w="274" w:type="dxa"/>
+            <w:tcW w:w="275" w:type="dxa"/>
             <w:tcBorders/>
           </w:tcPr>
           <w:p>
@@ -1182,9 +1161,8 @@
               </w:numPr>
               <w:suppressAutoHyphens w:val="true"/>
               <w:spacing w:before="0" w:after="0"/>
-              <w:ind w:right="176" w:hanging="0"/>
-              <w:rPr>
-                <w:b w:val="false"/>
+              <w:ind w:hanging="0" w:right="176"/>
+              <w:rPr>
                 <w:b w:val="false"/>
                 <w:bCs w:val="false"/>
               </w:rPr>
@@ -1212,11 +1190,10 @@
               </w:numPr>
               <w:suppressAutoHyphens w:val="true"/>
               <w:spacing w:before="0" w:after="0"/>
-              <w:ind w:right="176" w:hanging="0"/>
+              <w:ind w:hanging="0" w:right="176"/>
               <w:rPr>
                 <w:rFonts w:ascii="Liberation Sans" w:hAnsi="Liberation Sans" w:eastAsia="Noto Sans CJK SC Regular" w:cs="Arial"/>
                 <w:b w:val="false"/>
-                <w:b w:val="false"/>
                 <w:bCs w:val="false"/>
                 <w:color w:val="auto"/>
                 <w:kern w:val="2"/>
@@ -1236,7 +1213,59 @@
                 <w:szCs w:val="18"/>
                 <w:lang w:val="fr-CH" w:eastAsia="zh-CN" w:bidi="hi-IN"/>
               </w:rPr>
-              <w:t>{% if inputDateHeader %}{{ inputDateHeader | date("dd.MM.YYYY") }}{% if paperInputDateHeader %} ({{ paperInputDateHeader | date("dd.MM.YYYY") }}){% else %}{% endif %}{% else %}-{% endif %}</w:t>
+              <w:t>{% if inputDateHeader %}{{ inputDateHeader | date("dd.MM.</w:t>
+            </w:r>
+            <w:r>
+              <w:rPr>
+                <w:rFonts w:eastAsia="Noto Sans CJK SC Regular" w:cs="Arial" w:ascii="Liberation Sans" w:hAnsi="Liberation Sans"/>
+                <w:b w:val="false"/>
+                <w:bCs w:val="false"/>
+                <w:color w:val="auto"/>
+                <w:kern w:val="2"/>
+                <w:sz w:val="18"/>
+                <w:szCs w:val="18"/>
+                <w:lang w:val="fr-CH" w:eastAsia="zh-CN" w:bidi="hi-IN"/>
+              </w:rPr>
+              <w:t>yyyy</w:t>
+            </w:r>
+            <w:r>
+              <w:rPr>
+                <w:rFonts w:eastAsia="Noto Sans CJK SC Regular" w:cs="Arial" w:ascii="Liberation Sans" w:hAnsi="Liberation Sans"/>
+                <w:b w:val="false"/>
+                <w:bCs w:val="false"/>
+                <w:color w:val="auto"/>
+                <w:kern w:val="2"/>
+                <w:sz w:val="18"/>
+                <w:szCs w:val="18"/>
+                <w:lang w:val="fr-CH" w:eastAsia="zh-CN" w:bidi="hi-IN"/>
+              </w:rPr>
+              <w:t>") }}{% if paperInputDateHeader %} ({{ paperInputDateHeader | date("dd.MM.</w:t>
+            </w:r>
+            <w:r>
+              <w:rPr>
+                <w:rFonts w:eastAsia="Noto Sans CJK SC Regular" w:cs="Arial" w:ascii="Liberation Sans" w:hAnsi="Liberation Sans"/>
+                <w:b w:val="false"/>
+                <w:bCs w:val="false"/>
+                <w:color w:val="auto"/>
+                <w:kern w:val="2"/>
+                <w:sz w:val="18"/>
+                <w:szCs w:val="18"/>
+                <w:lang w:val="fr-CH" w:eastAsia="zh-CN" w:bidi="hi-IN"/>
+              </w:rPr>
+              <w:t>yyyy</w:t>
+            </w:r>
+            <w:r>
+              <w:rPr>
+                <w:rFonts w:eastAsia="Noto Sans CJK SC Regular" w:cs="Arial" w:ascii="Liberation Sans" w:hAnsi="Liberation Sans"/>
+                <w:b w:val="false"/>
+                <w:bCs w:val="false"/>
+                <w:color w:val="auto"/>
+                <w:kern w:val="2"/>
+                <w:sz w:val="18"/>
+                <w:szCs w:val="18"/>
+                <w:lang w:val="fr-CH" w:eastAsia="zh-CN" w:bidi="hi-IN"/>
+              </w:rPr>
+              <w:t>") }}){% else %}{% endif %}{% else %}-{% endif %}</w:t>
             </w:r>
           </w:p>
         </w:tc>
@@ -1245,7 +1274,7 @@
         <w:trPr/>
         <w:tc>
           <w:tcPr>
-            <w:tcW w:w="3869" w:type="dxa"/>
+            <w:tcW w:w="3868" w:type="dxa"/>
             <w:tcBorders/>
           </w:tcPr>
           <w:p>
@@ -1258,9 +1287,8 @@
               </w:numPr>
               <w:suppressAutoHyphens w:val="true"/>
               <w:spacing w:before="0" w:after="0"/>
-              <w:ind w:right="176" w:hanging="0"/>
-              <w:rPr>
-                <w:b w:val="false"/>
+              <w:ind w:hanging="0" w:right="176"/>
+              <w:rPr>
                 <w:b w:val="false"/>
                 <w:bCs w:val="false"/>
               </w:rPr>
@@ -1275,7 +1303,7 @@
         </w:tc>
         <w:tc>
           <w:tcPr>
-            <w:tcW w:w="274" w:type="dxa"/>
+            <w:tcW w:w="275" w:type="dxa"/>
             <w:tcBorders/>
           </w:tcPr>
           <w:p>
@@ -1288,9 +1316,8 @@
               </w:numPr>
               <w:suppressAutoHyphens w:val="true"/>
               <w:spacing w:before="0" w:after="0"/>
-              <w:ind w:right="176" w:hanging="0"/>
-              <w:rPr>
-                <w:b w:val="false"/>
+              <w:ind w:hanging="0" w:right="176"/>
+              <w:rPr>
                 <w:b w:val="false"/>
                 <w:bCs w:val="false"/>
               </w:rPr>
@@ -1318,7 +1345,7 @@
               </w:numPr>
               <w:suppressAutoHyphens w:val="true"/>
               <w:spacing w:before="0" w:after="0"/>
-              <w:ind w:right="176" w:hanging="0"/>
+              <w:ind w:hanging="0" w:right="176"/>
               <w:rPr/>
             </w:pPr>
             <w:r>
@@ -1331,7 +1358,7 @@
         <w:trPr/>
         <w:tc>
           <w:tcPr>
-            <w:tcW w:w="3869" w:type="dxa"/>
+            <w:tcW w:w="3868" w:type="dxa"/>
             <w:tcBorders/>
           </w:tcPr>
           <w:p>
@@ -1344,10 +1371,9 @@
               </w:numPr>
               <w:suppressAutoHyphens w:val="true"/>
               <w:spacing w:before="0" w:after="0"/>
-              <w:ind w:right="176" w:hanging="0"/>
+              <w:ind w:hanging="0" w:right="176"/>
               <w:rPr>
                 <w:rFonts w:ascii="Liberation Sans" w:hAnsi="Liberation Sans" w:eastAsia="Noto Sans CJK SC Regular" w:cs="Arial"/>
-                <w:b/>
                 <w:b/>
                 <w:bCs/>
                 <w:color w:val="auto"/>
@@ -1374,7 +1400,7 @@
         </w:tc>
         <w:tc>
           <w:tcPr>
-            <w:tcW w:w="274" w:type="dxa"/>
+            <w:tcW w:w="275" w:type="dxa"/>
             <w:tcBorders/>
           </w:tcPr>
           <w:p>
@@ -1387,7 +1413,7 @@
               </w:numPr>
               <w:suppressAutoHyphens w:val="true"/>
               <w:spacing w:before="0" w:after="0"/>
-              <w:ind w:right="176" w:hanging="0"/>
+              <w:ind w:hanging="0" w:right="176"/>
               <w:rPr/>
             </w:pPr>
             <w:r>
@@ -1410,10 +1436,9 @@
               </w:numPr>
               <w:suppressAutoHyphens w:val="true"/>
               <w:spacing w:before="0" w:after="0"/>
-              <w:ind w:right="176" w:hanging="0"/>
+              <w:ind w:hanging="0" w:right="176"/>
               <w:rPr>
                 <w:rFonts w:ascii="Liberation Sans" w:hAnsi="Liberation Sans" w:eastAsia="Noto Sans CJK SC Regular" w:cs="Arial"/>
-                <w:b/>
                 <w:b/>
                 <w:bCs/>
                 <w:color w:val="auto"/>
@@ -1443,7 +1468,7 @@
         <w:trPr/>
         <w:tc>
           <w:tcPr>
-            <w:tcW w:w="3869" w:type="dxa"/>
+            <w:tcW w:w="3868" w:type="dxa"/>
             <w:tcBorders/>
           </w:tcPr>
           <w:p>
@@ -1456,10 +1481,9 @@
               </w:numPr>
               <w:suppressAutoHyphens w:val="true"/>
               <w:spacing w:before="0" w:after="0"/>
-              <w:ind w:right="176" w:hanging="0"/>
+              <w:ind w:hanging="0" w:right="176"/>
               <w:rPr>
                 <w:rFonts w:ascii="Liberation Sans" w:hAnsi="Liberation Sans" w:eastAsia="Noto Sans CJK SC Regular" w:cs="Arial"/>
-                <w:b w:val="false"/>
                 <w:b w:val="false"/>
                 <w:bCs w:val="false"/>
                 <w:color w:val="auto"/>
@@ -1486,7 +1510,7 @@
         </w:tc>
         <w:tc>
           <w:tcPr>
-            <w:tcW w:w="274" w:type="dxa"/>
+            <w:tcW w:w="275" w:type="dxa"/>
             <w:tcBorders/>
           </w:tcPr>
           <w:p>
@@ -1499,7 +1523,7 @@
               </w:numPr>
               <w:suppressAutoHyphens w:val="true"/>
               <w:spacing w:before="0" w:after="0"/>
-              <w:ind w:right="176" w:hanging="0"/>
+              <w:ind w:hanging="0" w:right="176"/>
               <w:rPr/>
             </w:pPr>
             <w:r>
@@ -1522,10 +1546,9 @@
               </w:numPr>
               <w:suppressAutoHyphens w:val="true"/>
               <w:spacing w:before="0" w:after="0"/>
-              <w:ind w:right="176" w:hanging="0"/>
+              <w:ind w:hanging="0" w:right="176"/>
               <w:rPr>
                 <w:rFonts w:ascii="Liberation Sans" w:hAnsi="Liberation Sans" w:eastAsia="Noto Sans CJK SC Regular" w:cs="Arial"/>
-                <w:b w:val="false"/>
                 <w:b w:val="false"/>
                 <w:bCs w:val="false"/>
                 <w:color w:val="auto"/>
@@ -1559,7 +1582,7 @@
         <w:suppressAutoHyphens w:val="true"/>
         <w:rPr>
           <w:rFonts w:ascii="Liberation Sans" w:hAnsi="Liberation Sans" w:cs="Arial"/>
-          <w:color w:val="C0504D" w:themeColor="accent2"/>
+          <w:color w:themeColor="accent2" w:val="C0504D"/>
           <w:sz w:val="18"/>
           <w:szCs w:val="18"/>
           <w:lang w:val="fr-CH"/>
@@ -1568,7 +1591,7 @@
       <w:r>
         <w:rPr>
           <w:rFonts w:cs="Arial" w:ascii="Liberation Sans" w:hAnsi="Liberation Sans"/>
-          <w:color w:val="C0504D" w:themeColor="accent2"/>
+          <w:color w:themeColor="accent2" w:val="C0504D"/>
           <w:sz w:val="18"/>
           <w:szCs w:val="18"/>
           <w:lang w:val="fr-CH"/>
@@ -1583,9 +1606,10 @@
         <w:pStyle w:val="Normal"/>
         <w:widowControl w:val="false"/>
         <w:suppressAutoHyphens w:val="true"/>
+        <w:spacing w:before="0" w:after="0"/>
         <w:rPr>
           <w:rFonts w:ascii="Liberation Sans" w:hAnsi="Liberation Sans" w:cs="Arial"/>
-          <w:color w:val="C0504D" w:themeColor="accent2"/>
+          <w:color w:themeColor="accent2" w:val="C0504D"/>
           <w:sz w:val="18"/>
           <w:szCs w:val="18"/>
           <w:lang w:val="fr-CH"/>
@@ -1594,7 +1618,7 @@
       <w:r>
         <w:rPr>
           <w:rFonts w:cs="Arial" w:ascii="Liberation Sans" w:hAnsi="Liberation Sans"/>
-          <w:color w:val="C0504D" w:themeColor="accent2"/>
+          <w:color w:themeColor="accent2" w:val="C0504D"/>
           <w:sz w:val="18"/>
           <w:szCs w:val="18"/>
           <w:lang w:val="fr-CH"/>
@@ -1608,7 +1632,7 @@
         <w:suppressAutoHyphens w:val="true"/>
         <w:rPr>
           <w:rFonts w:ascii="Liberation Sans" w:hAnsi="Liberation Sans" w:cs="Arial"/>
-          <w:color w:val="C0504D" w:themeColor="accent2"/>
+          <w:color w:themeColor="accent2" w:val="C0504D"/>
           <w:sz w:val="18"/>
           <w:szCs w:val="18"/>
           <w:lang w:val="fr-CH"/>
@@ -1617,7 +1641,7 @@
       <w:r>
         <w:rPr>
           <w:rFonts w:cs="Arial" w:ascii="Liberation Sans" w:hAnsi="Liberation Sans"/>
-          <w:color w:val="C0504D" w:themeColor="accent2"/>
+          <w:color w:themeColor="accent2" w:val="C0504D"/>
           <w:sz w:val="18"/>
           <w:szCs w:val="18"/>
           <w:lang w:val="fr-CH"/>
@@ -1631,7 +1655,7 @@
         <w:suppressAutoHyphens w:val="true"/>
         <w:rPr>
           <w:rFonts w:ascii="Liberation Sans" w:hAnsi="Liberation Sans" w:cs="Arial"/>
-          <w:color w:val="C0504D" w:themeColor="accent2"/>
+          <w:color w:themeColor="accent2" w:val="C0504D"/>
           <w:sz w:val="18"/>
           <w:szCs w:val="18"/>
           <w:lang w:val="fr-CH"/>
@@ -1640,7 +1664,7 @@
       <w:r>
         <w:rPr>
           <w:rFonts w:cs="Arial" w:ascii="Liberation Sans" w:hAnsi="Liberation Sans"/>
-          <w:color w:val="C0504D" w:themeColor="accent2"/>
+          <w:color w:themeColor="accent2" w:val="C0504D"/>
           <w:sz w:val="18"/>
           <w:szCs w:val="18"/>
           <w:lang w:val="fr-CH"/>
@@ -1657,7 +1681,7 @@
       <w:r>
         <w:rPr>
           <w:rFonts w:cs="Arial" w:ascii="Liberation Sans" w:hAnsi="Liberation Sans"/>
-          <w:color w:val="C0504D" w:themeColor="accent2"/>
+          <w:color w:themeColor="accent2" w:val="C0504D"/>
           <w:sz w:val="18"/>
           <w:szCs w:val="18"/>
           <w:lang w:val="fr-CH"/>
@@ -1675,7 +1699,7 @@
       <w:r>
         <w:rPr>
           <w:rFonts w:cs="Arial" w:ascii="Liberation Sans" w:hAnsi="Liberation Sans"/>
-          <w:color w:val="C0504D" w:themeColor="accent2"/>
+          <w:color w:themeColor="accent2" w:val="C0504D"/>
           <w:sz w:val="18"/>
           <w:szCs w:val="18"/>
           <w:lang w:val="fr-CH"/>
@@ -1685,7 +1709,7 @@
       <w:r>
         <w:rPr>
           <w:rFonts w:eastAsia="Noto Sans CJK SC Regular" w:cs="Arial" w:ascii="Liberation Sans" w:hAnsi="Liberation Sans"/>
-          <w:color w:val="C0504D" w:themeColor="accent2"/>
+          <w:color w:themeColor="accent2" w:val="C0504D"/>
           <w:kern w:val="2"/>
           <w:sz w:val="18"/>
           <w:szCs w:val="18"/>
@@ -1701,7 +1725,7 @@
         <w:suppressAutoHyphens w:val="true"/>
         <w:rPr>
           <w:rFonts w:ascii="Liberation Sans" w:hAnsi="Liberation Sans" w:eastAsia="Noto Sans CJK SC Regular" w:cs="Arial"/>
-          <w:color w:val="C0504D" w:themeColor="accent2"/>
+          <w:color w:themeColor="accent2" w:val="C0504D"/>
           <w:kern w:val="2"/>
           <w:sz w:val="18"/>
           <w:szCs w:val="18"/>
@@ -1711,7 +1735,7 @@
       <w:r>
         <w:rPr>
           <w:rFonts w:eastAsia="Noto Sans CJK SC Regular" w:cs="Arial" w:ascii="Liberation Sans" w:hAnsi="Liberation Sans"/>
-          <w:color w:val="C0504D" w:themeColor="accent2"/>
+          <w:color w:themeColor="accent2" w:val="C0504D"/>
           <w:kern w:val="2"/>
           <w:sz w:val="18"/>
           <w:szCs w:val="18"/>
@@ -1759,7 +1783,7 @@
         <w:pStyle w:val="Normal"/>
         <w:rPr>
           <w:rFonts w:ascii="Liberation Sans" w:hAnsi="Liberation Sans" w:eastAsia="Noto Sans CJK SC Regular" w:cs="Arial"/>
-          <w:color w:val="C0504D" w:themeColor="accent2"/>
+          <w:color w:themeColor="accent2" w:val="C0504D"/>
           <w:kern w:val="2"/>
           <w:sz w:val="18"/>
           <w:szCs w:val="18"/>
@@ -1769,7 +1793,7 @@
       <w:r>
         <w:rPr>
           <w:rFonts w:eastAsia="Noto Sans CJK SC Regular" w:cs="Arial" w:ascii="Liberation Sans" w:hAnsi="Liberation Sans"/>
-          <w:color w:val="C0504D" w:themeColor="accent2"/>
+          <w:color w:themeColor="accent2" w:val="C0504D"/>
           <w:kern w:val="2"/>
           <w:sz w:val="18"/>
           <w:szCs w:val="18"/>
@@ -1819,7 +1843,7 @@
               <w:jc w:val="left"/>
               <w:rPr>
                 <w:rFonts w:ascii="Liberation Sans" w:hAnsi="Liberation Sans" w:cs="Arial"/>
-                <w:color w:val="4F81BD" w:themeColor="accent1"/>
+                <w:color w:themeColor="accent1" w:val="4F81BD"/>
                 <w:sz w:val="18"/>
                 <w:szCs w:val="18"/>
                 <w:lang w:val="fr-CH"/>
@@ -1828,8 +1852,8 @@
             <w:r>
               <w:rPr>
                 <w:rFonts w:cs="Arial" w:ascii="Liberation Sans" w:hAnsi="Liberation Sans"/>
-                <w:color w:val="4F81BD" w:themeColor="accent1"/>
-                <w:sz w:val="20"/>
+                <w:color w:themeColor="accent1" w:val="4F81BD"/>
+                <w:sz w:val="18"/>
                 <w:szCs w:val="18"/>
                 <w:lang w:val="fr-CH"/>
               </w:rPr>
@@ -1864,7 +1888,7 @@
               </w:numPr>
               <w:suppressAutoHyphens w:val="true"/>
               <w:spacing w:before="0" w:after="0"/>
-              <w:ind w:right="176" w:hanging="0"/>
+              <w:ind w:hanging="0" w:right="176"/>
               <w:rPr/>
             </w:pPr>
             <w:r>
@@ -1918,7 +1942,9 @@
               <w:widowControl w:val="false"/>
               <w:suppressAutoHyphens w:val="true"/>
               <w:jc w:val="left"/>
-              <w:rPr/>
+              <w:rPr>
+                <w:sz w:val="20"/>
+              </w:rPr>
             </w:pPr>
             <w:r>
               <w:rPr>
@@ -1937,7 +1963,9 @@
               <w:widowControl w:val="false"/>
               <w:suppressAutoHyphens w:val="true"/>
               <w:jc w:val="left"/>
-              <w:rPr/>
+              <w:rPr>
+                <w:sz w:val="20"/>
+              </w:rPr>
             </w:pPr>
             <w:r>
               <w:rPr>
@@ -1956,7 +1984,9 @@
               <w:widowControl w:val="false"/>
               <w:suppressAutoHyphens w:val="true"/>
               <w:jc w:val="left"/>
-              <w:rPr/>
+              <w:rPr>
+                <w:sz w:val="20"/>
+              </w:rPr>
             </w:pPr>
             <w:r>
               <w:rPr>
@@ -1975,7 +2005,9 @@
               <w:widowControl w:val="false"/>
               <w:suppressAutoHyphens w:val="true"/>
               <w:jc w:val="left"/>
-              <w:rPr/>
+              <w:rPr>
+                <w:sz w:val="20"/>
+              </w:rPr>
             </w:pPr>
             <w:r>
               <w:rPr>
@@ -1994,7 +2026,9 @@
               <w:widowControl w:val="false"/>
               <w:suppressAutoHyphens w:val="true"/>
               <w:jc w:val="left"/>
-              <w:rPr/>
+              <w:rPr>
+                <w:sz w:val="20"/>
+              </w:rPr>
             </w:pPr>
             <w:r>
               <w:rPr>
@@ -2013,7 +2047,9 @@
               <w:widowControl w:val="false"/>
               <w:suppressAutoHyphens w:val="true"/>
               <w:jc w:val="left"/>
-              <w:rPr/>
+              <w:rPr>
+                <w:sz w:val="20"/>
+              </w:rPr>
             </w:pPr>
             <w:r>
               <w:rPr>
@@ -2032,7 +2068,9 @@
               <w:widowControl w:val="false"/>
               <w:suppressAutoHyphens w:val="true"/>
               <w:jc w:val="left"/>
-              <w:rPr/>
+              <w:rPr>
+                <w:sz w:val="20"/>
+              </w:rPr>
             </w:pPr>
             <w:r>
               <w:rPr>
@@ -2051,7 +2089,9 @@
               <w:widowControl w:val="false"/>
               <w:suppressAutoHyphens w:val="true"/>
               <w:jc w:val="left"/>
-              <w:rPr/>
+              <w:rPr>
+                <w:sz w:val="20"/>
+              </w:rPr>
             </w:pPr>
             <w:r>
               <w:rPr>
@@ -2070,16 +2110,78 @@
               <w:widowControl w:val="false"/>
               <w:suppressAutoHyphens w:val="true"/>
               <w:jc w:val="left"/>
-              <w:rPr/>
+              <w:rPr>
+                <w:sz w:val="20"/>
+              </w:rPr>
             </w:pPr>
             <w:r>
               <w:rPr>
                 <w:rFonts w:cs="Arial" w:ascii="Liberation Sans" w:hAnsi="Liberation Sans"/>
-                <w:color w:val="auto"/>
                 <w:sz w:val="18"/>
                 <w:szCs w:val="18"/>
                 <w:lang w:val="fr-CH"/>
               </w:rPr>
+              <w:t xml:space="preserve">{%p elif </w:t>
+            </w:r>
+            <w:r>
+              <w:rPr>
+                <w:rFonts w:cs="Arial" w:ascii="Liberation Sans" w:hAnsi="Liberation Sans"/>
+                <w:color w:val="auto"/>
+                <w:sz w:val="18"/>
+                <w:szCs w:val="18"/>
+                <w:lang w:val="fr-CH"/>
+              </w:rPr>
+              <w:t>section</w:t>
+            </w:r>
+            <w:r>
+              <w:rPr>
+                <w:rFonts w:cs="Arial" w:ascii="Liberation Sans" w:hAnsi="Liberation Sans"/>
+                <w:sz w:val="18"/>
+                <w:szCs w:val="18"/>
+                <w:lang w:val="fr-CH"/>
+              </w:rPr>
+              <w:t>.type == "CalculatedFloatQuestion" %}</w:t>
+            </w:r>
+          </w:p>
+          <w:p>
+            <w:pPr>
+              <w:pStyle w:val="Normal"/>
+              <w:widowControl w:val="false"/>
+              <w:suppressAutoHyphens w:val="true"/>
+              <w:jc w:val="left"/>
+              <w:rPr>
+                <w:sz w:val="20"/>
+              </w:rPr>
+            </w:pPr>
+            <w:r>
+              <w:rPr>
+                <w:rFonts w:cs="Arial" w:ascii="Liberation Sans" w:hAnsi="Liberation Sans"/>
+                <w:color w:val="auto"/>
+                <w:sz w:val="18"/>
+                <w:szCs w:val="18"/>
+                <w:lang w:val="fr-CH"/>
+              </w:rPr>
+              <w:t>{{ section.value | emptystring }}</w:t>
+            </w:r>
+          </w:p>
+          <w:p>
+            <w:pPr>
+              <w:pStyle w:val="Normal"/>
+              <w:widowControl w:val="false"/>
+              <w:suppressAutoHyphens w:val="true"/>
+              <w:jc w:val="left"/>
+              <w:rPr>
+                <w:sz w:val="20"/>
+              </w:rPr>
+            </w:pPr>
+            <w:r>
+              <w:rPr>
+                <w:rFonts w:cs="Arial" w:ascii="Liberation Sans" w:hAnsi="Liberation Sans"/>
+                <w:color w:val="auto"/>
+                <w:sz w:val="18"/>
+                <w:szCs w:val="18"/>
+                <w:lang w:val="fr-CH"/>
+              </w:rPr>
               <w:t>{%p elif section.type == "ChoiceQuestion" %}</w:t>
             </w:r>
           </w:p>
@@ -2089,7 +2191,9 @@
               <w:widowControl w:val="false"/>
               <w:suppressAutoHyphens w:val="true"/>
               <w:jc w:val="left"/>
-              <w:rPr/>
+              <w:rPr>
+                <w:sz w:val="20"/>
+              </w:rPr>
             </w:pPr>
             <w:r>
               <w:rPr>
@@ -2107,9 +2211,11 @@
               <w:pStyle w:val="Normal"/>
               <w:widowControl w:val="false"/>
               <w:suppressAutoHyphens w:val="true"/>
-              <w:ind w:left="459" w:hanging="459"/>
+              <w:ind w:hanging="459" w:left="459"/>
               <w:jc w:val="left"/>
-              <w:rPr/>
+              <w:rPr>
+                <w:sz w:val="20"/>
+              </w:rPr>
             </w:pPr>
             <w:r>
               <w:rPr>
@@ -2234,7 +2340,9 @@
               <w:widowControl w:val="false"/>
               <w:suppressAutoHyphens w:val="true"/>
               <w:jc w:val="left"/>
-              <w:rPr/>
+              <w:rPr>
+                <w:sz w:val="20"/>
+              </w:rPr>
             </w:pPr>
             <w:r>
               <w:rPr>
@@ -2253,7 +2361,9 @@
               <w:widowControl w:val="false"/>
               <w:suppressAutoHyphens w:val="true"/>
               <w:jc w:val="left"/>
-              <w:rPr/>
+              <w:rPr>
+                <w:sz w:val="20"/>
+              </w:rPr>
             </w:pPr>
             <w:r>
               <w:rPr>
@@ -2272,7 +2382,9 @@
               <w:widowControl w:val="false"/>
               <w:suppressAutoHyphens w:val="true"/>
               <w:jc w:val="left"/>
-              <w:rPr/>
+              <w:rPr>
+                <w:sz w:val="20"/>
+              </w:rPr>
             </w:pPr>
             <w:r>
               <w:rPr>
@@ -2290,9 +2402,11 @@
               <w:pStyle w:val="Normal"/>
               <w:widowControl w:val="false"/>
               <w:suppressAutoHyphens w:val="true"/>
-              <w:ind w:left="459" w:hanging="459"/>
+              <w:ind w:hanging="459" w:left="459"/>
               <w:jc w:val="left"/>
-              <w:rPr/>
+              <w:rPr>
+                <w:sz w:val="20"/>
+              </w:rPr>
             </w:pPr>
             <w:r>
               <w:rPr>
@@ -2417,7 +2531,9 @@
               <w:widowControl w:val="false"/>
               <w:suppressAutoHyphens w:val="true"/>
               <w:jc w:val="left"/>
-              <w:rPr/>
+              <w:rPr>
+                <w:sz w:val="20"/>
+              </w:rPr>
             </w:pPr>
             <w:r>
               <w:rPr>
@@ -2436,7 +2552,9 @@
               <w:widowControl w:val="false"/>
               <w:suppressAutoHyphens w:val="true"/>
               <w:jc w:val="left"/>
-              <w:rPr/>
+              <w:rPr>
+                <w:sz w:val="20"/>
+              </w:rPr>
             </w:pPr>
             <w:r>
               <w:rPr>
@@ -2455,7 +2573,9 @@
               <w:widowControl w:val="false"/>
               <w:suppressAutoHyphens w:val="true"/>
               <w:jc w:val="left"/>
-              <w:rPr/>
+              <w:rPr>
+                <w:sz w:val="20"/>
+              </w:rPr>
             </w:pPr>
             <w:r>
               <w:rPr>
@@ -2465,7 +2585,27 @@
                 <w:szCs w:val="18"/>
                 <w:lang w:val="fr-CH"/>
               </w:rPr>
-              <w:t>{{ section.value | date("dd.MM.YYYY") }}</w:t>
+              <w:t>{{ section.value | date("dd.MM.</w:t>
+            </w:r>
+            <w:r>
+              <w:rPr>
+                <w:rFonts w:cs="Arial" w:ascii="Liberation Sans" w:hAnsi="Liberation Sans"/>
+                <w:color w:val="auto"/>
+                <w:sz w:val="18"/>
+                <w:szCs w:val="18"/>
+                <w:lang w:val="fr-CH"/>
+              </w:rPr>
+              <w:t>yyyy</w:t>
+            </w:r>
+            <w:r>
+              <w:rPr>
+                <w:rFonts w:cs="Arial" w:ascii="Liberation Sans" w:hAnsi="Liberation Sans"/>
+                <w:color w:val="auto"/>
+                <w:sz w:val="18"/>
+                <w:szCs w:val="18"/>
+                <w:lang w:val="fr-CH"/>
+              </w:rPr>
+              <w:t>") }}</w:t>
             </w:r>
           </w:p>
           <w:p>
@@ -2474,7 +2614,9 @@
               <w:widowControl w:val="false"/>
               <w:suppressAutoHyphens w:val="true"/>
               <w:jc w:val="left"/>
-              <w:rPr/>
+              <w:rPr>
+                <w:sz w:val="20"/>
+              </w:rPr>
             </w:pPr>
             <w:r>
               <w:rPr>
@@ -2493,7 +2635,9 @@
               <w:widowControl w:val="false"/>
               <w:suppressAutoHyphens w:val="true"/>
               <w:jc w:val="left"/>
-              <w:rPr/>
+              <w:rPr>
+                <w:sz w:val="20"/>
+              </w:rPr>
             </w:pPr>
             <w:r>
               <w:rPr>
@@ -2512,7 +2656,9 @@
               <w:widowControl w:val="false"/>
               <w:suppressAutoHyphens w:val="true"/>
               <w:jc w:val="left"/>
-              <w:rPr/>
+              <w:rPr>
+                <w:sz w:val="20"/>
+              </w:rPr>
             </w:pPr>
             <w:r>
               <w:rPr>
@@ -2531,7 +2677,9 @@
               <w:widowControl w:val="false"/>
               <w:suppressAutoHyphens w:val="true"/>
               <w:jc w:val="left"/>
-              <w:rPr/>
+              <w:rPr>
+                <w:sz w:val="20"/>
+              </w:rPr>
             </w:pPr>
             <w:r>
               <w:rPr>
@@ -2550,7 +2698,9 @@
               <w:widowControl w:val="false"/>
               <w:suppressAutoHyphens w:val="true"/>
               <w:jc w:val="left"/>
-              <w:rPr/>
+              <w:rPr>
+                <w:sz w:val="20"/>
+              </w:rPr>
             </w:pPr>
             <w:r>
               <w:rPr>
@@ -2604,7 +2754,9 @@
                     <w:widowControl w:val="false"/>
                     <w:suppressAutoHyphens w:val="true"/>
                     <w:jc w:val="left"/>
-                    <w:rPr/>
+                    <w:rPr>
+                      <w:sz w:val="20"/>
+                    </w:rPr>
                   </w:pPr>
                   <w:r>
                     <w:rPr>
@@ -2639,7 +2791,9 @@
                     <w:widowControl w:val="false"/>
                     <w:suppressAutoHyphens w:val="true"/>
                     <w:jc w:val="left"/>
-                    <w:rPr/>
+                    <w:rPr>
+                      <w:sz w:val="20"/>
+                    </w:rPr>
                   </w:pPr>
                   <w:r>
                     <w:rPr>
@@ -2714,7 +2868,9 @@
                     <w:widowControl w:val="false"/>
                     <w:suppressAutoHyphens w:val="true"/>
                     <w:jc w:val="left"/>
-                    <w:rPr/>
+                    <w:rPr>
+                      <w:sz w:val="20"/>
+                    </w:rPr>
                   </w:pPr>
                   <w:r>
                     <w:rPr>
@@ -2745,7 +2901,9 @@
                     <w:widowControl w:val="false"/>
                     <w:suppressAutoHyphens w:val="true"/>
                     <w:jc w:val="left"/>
-                    <w:rPr/>
+                    <w:rPr>
+                      <w:sz w:val="20"/>
+                    </w:rPr>
                   </w:pPr>
                   <w:r>
                     <w:rPr>
@@ -2781,7 +2939,9 @@
                     <w:widowControl w:val="false"/>
                     <w:suppressAutoHyphens w:val="true"/>
                     <w:jc w:val="left"/>
-                    <w:rPr/>
+                    <w:rPr>
+                      <w:sz w:val="20"/>
+                    </w:rPr>
                   </w:pPr>
                   <w:r>
                     <w:rPr>
@@ -2817,7 +2977,9 @@
                     <w:widowControl w:val="false"/>
                     <w:suppressAutoHyphens w:val="true"/>
                     <w:jc w:val="left"/>
-                    <w:rPr/>
+                    <w:rPr>
+                      <w:sz w:val="20"/>
+                    </w:rPr>
                   </w:pPr>
                   <w:r>
                     <w:rPr>
@@ -2848,10 +3010,30 @@
             <w:r>
               <w:rPr>
                 <w:rFonts w:cs="Arial" w:ascii="Liberation Sans" w:hAnsi="Liberation Sans"/>
+                <w:sz w:val="18"/>
+                <w:szCs w:val="18"/>
+                <w:lang w:val="fr-CH"/>
+              </w:rPr>
+            </w:r>
+          </w:p>
+          <w:p>
+            <w:pPr>
+              <w:pStyle w:val="Normal"/>
+              <w:widowControl w:val="false"/>
+              <w:suppressAutoHyphens w:val="true"/>
+              <w:jc w:val="left"/>
+              <w:rPr>
                 <w:sz w:val="20"/>
+              </w:rPr>
+            </w:pPr>
+            <w:r>
+              <w:rPr>
+                <w:rFonts w:cs="Arial" w:ascii="Liberation Sans" w:hAnsi="Liberation Sans"/>
+                <w:sz w:val="18"/>
                 <w:szCs w:val="18"/>
                 <w:lang w:val="fr-CH"/>
               </w:rPr>
+              <w:t>{%p endfor %}</w:t>
             </w:r>
           </w:p>
           <w:p>
@@ -2860,16 +3042,17 @@
               <w:widowControl w:val="false"/>
               <w:suppressAutoHyphens w:val="true"/>
               <w:jc w:val="left"/>
-              <w:rPr/>
+              <w:rPr>
+                <w:sz w:val="20"/>
+              </w:rPr>
             </w:pPr>
             <w:r>
               <w:rPr>
                 <w:rFonts w:cs="Arial" w:ascii="Liberation Sans" w:hAnsi="Liberation Sans"/>
                 <w:sz w:val="18"/>
                 <w:szCs w:val="18"/>
-                <w:lang w:val="fr-CH"/>
-              </w:rPr>
-              <w:t>{%p endfor %}</w:t>
+              </w:rPr>
+              <w:t>{%p endif %}</w:t>
             </w:r>
           </w:p>
           <w:p>
@@ -2878,24 +3061,9 @@
               <w:widowControl w:val="false"/>
               <w:suppressAutoHyphens w:val="true"/>
               <w:jc w:val="left"/>
-              <w:rPr/>
-            </w:pPr>
-            <w:r>
-              <w:rPr>
-                <w:rFonts w:cs="Arial" w:ascii="Liberation Sans" w:hAnsi="Liberation Sans"/>
-                <w:sz w:val="18"/>
-                <w:szCs w:val="18"/>
-              </w:rPr>
-              <w:t>{%p endif %}</w:t>
-            </w:r>
-          </w:p>
-          <w:p>
-            <w:pPr>
-              <w:pStyle w:val="Normal"/>
-              <w:widowControl w:val="false"/>
-              <w:suppressAutoHyphens w:val="true"/>
-              <w:jc w:val="left"/>
-              <w:rPr/>
+              <w:rPr>
+                <w:sz w:val="20"/>
+              </w:rPr>
             </w:pPr>
             <w:r>
               <w:rPr>
@@ -2922,7 +3090,7 @@
             <w:r>
               <w:rPr>
                 <w:rFonts w:cs="Arial" w:ascii="Liberation Sans" w:hAnsi="Liberation Sans"/>
-                <w:sz w:val="20"/>
+                <w:sz w:val="2"/>
                 <w:szCs w:val="2"/>
               </w:rPr>
             </w:r>
@@ -2940,7 +3108,7 @@
       <w:r>
         <w:rPr>
           <w:rFonts w:cs="Arial" w:ascii="Liberation Sans" w:hAnsi="Liberation Sans"/>
-          <w:color w:val="C0504D" w:themeColor="accent2"/>
+          <w:color w:themeColor="accent2" w:val="C0504D"/>
           <w:sz w:val="18"/>
           <w:szCs w:val="18"/>
           <w:lang w:val="fr-CH"/>
@@ -2958,7 +3126,7 @@
       <w:r>
         <w:rPr>
           <w:rFonts w:cs="Arial" w:ascii="Liberation Sans" w:hAnsi="Liberation Sans"/>
-          <w:color w:val="C0504D" w:themeColor="accent2"/>
+          <w:color w:themeColor="accent2" w:val="C0504D"/>
           <w:sz w:val="18"/>
           <w:szCs w:val="18"/>
           <w:lang w:val="fr-CH"/>
@@ -2967,8 +3135,12 @@
       </w:r>
     </w:p>
     <w:sectPr>
-      <w:headerReference w:type="default" r:id="rId6"/>
-      <w:footerReference w:type="default" r:id="rId7"/>
+      <w:headerReference w:type="even" r:id="rId6"/>
+      <w:headerReference w:type="default" r:id="rId7"/>
+      <w:headerReference w:type="first" r:id="rId8"/>
+      <w:footerReference w:type="even" r:id="rId9"/>
+      <w:footerReference w:type="default" r:id="rId10"/>
+      <w:footerReference w:type="first" r:id="rId11"/>
       <w:type w:val="nextPage"/>
       <w:pgSz w:w="11906" w:h="16838"/>
       <w:pgMar w:left="1843" w:right="1134" w:gutter="0" w:header="0" w:top="1134" w:footer="318" w:bottom="1134"/>
@@ -2982,6 +3154,20 @@
 </file>
 
 <file path=word/footer1.xml><?xml version="1.0" encoding="utf-8"?>
+<w:ftr xmlns:o="urn:schemas-microsoft-com:office:office" xmlns:r="http://schemas.openxmlformats.org/officeDocument/2006/relationships" xmlns:v="urn:schemas-microsoft-com:vml" xmlns:w="http://schemas.openxmlformats.org/wordprocessingml/2006/main" xmlns:w10="urn:schemas-microsoft-com:office:word" xmlns:wp="http://schemas.openxmlformats.org/drawingml/2006/wordprocessingDrawing" xmlns:wps="http://schemas.microsoft.com/office/word/2010/wordprocessingShape" xmlns:wpg="http://schemas.microsoft.com/office/word/2010/wordprocessingGroup" xmlns:mc="http://schemas.openxmlformats.org/markup-compatibility/2006" xmlns:wp14="http://schemas.microsoft.com/office/word/2010/wordprocessingDrawing" xmlns:w14="http://schemas.microsoft.com/office/word/2010/wordml" xmlns:w15="http://schemas.microsoft.com/office/word/2012/wordml" mc:Ignorable="w14 wp14 w15">
+  <w:p>
+    <w:pPr>
+      <w:pStyle w:val="Footer"/>
+      <w:rPr/>
+    </w:pPr>
+    <w:r>
+      <w:rPr/>
+    </w:r>
+  </w:p>
+</w:ftr>
+</file>
+
+<file path=word/footer2.xml><?xml version="1.0" encoding="utf-8"?>
 <w:ftr xmlns:o="urn:schemas-microsoft-com:office:office" xmlns:r="http://schemas.openxmlformats.org/officeDocument/2006/relationships" xmlns:v="urn:schemas-microsoft-com:vml" xmlns:w="http://schemas.openxmlformats.org/wordprocessingml/2006/main" xmlns:w10="urn:schemas-microsoft-com:office:word" xmlns:wp="http://schemas.openxmlformats.org/drawingml/2006/wordprocessingDrawing" xmlns:wps="http://schemas.microsoft.com/office/word/2010/wordprocessingShape" xmlns:wpg="http://schemas.microsoft.com/office/word/2010/wordprocessingGroup" xmlns:mc="http://schemas.openxmlformats.org/markup-compatibility/2006" xmlns:wp14="http://schemas.microsoft.com/office/word/2010/wordprocessingDrawing" xmlns:w14="http://schemas.microsoft.com/office/word/2010/wordml" xmlns:w15="http://schemas.microsoft.com/office/word/2012/wordml" mc:Ignorable="w14 wp14 w15">
   <w:p>
     <w:pPr>
@@ -3023,7 +3209,120 @@
         <w:szCs w:val="18"/>
         <w:rFonts w:ascii="Calibri" w:hAnsi="Calibri"/>
       </w:rPr>
+      <w:t>1</w:t>
+    </w:r>
+    <w:r>
+      <w:rPr>
+        <w:sz w:val="18"/>
+        <w:szCs w:val="18"/>
+        <w:rFonts w:ascii="Calibri" w:hAnsi="Calibri"/>
+      </w:rPr>
+      <w:fldChar w:fldCharType="end"/>
+    </w:r>
+    <w:r>
+      <w:rPr>
+        <w:rFonts w:ascii="Calibri" w:hAnsi="Calibri" w:asciiTheme="minorHAnsi" w:hAnsiTheme="minorHAnsi"/>
+        <w:sz w:val="18"/>
+        <w:szCs w:val="18"/>
+      </w:rPr>
+      <w:t>/</w:t>
+    </w:r>
+    <w:r>
+      <w:rPr>
+        <w:rFonts w:ascii="Calibri" w:hAnsi="Calibri"/>
+        <w:sz w:val="18"/>
+        <w:szCs w:val="18"/>
+      </w:rPr>
+      <w:fldChar w:fldCharType="begin"/>
+    </w:r>
+    <w:r>
+      <w:rPr>
+        <w:sz w:val="18"/>
+        <w:szCs w:val="18"/>
+        <w:rFonts w:ascii="Calibri" w:hAnsi="Calibri"/>
+      </w:rPr>
+      <w:instrText xml:space="preserve"> NUMPAGES </w:instrText>
+    </w:r>
+    <w:r>
+      <w:rPr>
+        <w:sz w:val="18"/>
+        <w:szCs w:val="18"/>
+        <w:rFonts w:ascii="Calibri" w:hAnsi="Calibri"/>
+      </w:rPr>
+      <w:fldChar w:fldCharType="separate"/>
+    </w:r>
+    <w:r>
+      <w:rPr>
+        <w:sz w:val="18"/>
+        <w:szCs w:val="18"/>
+        <w:rFonts w:ascii="Calibri" w:hAnsi="Calibri"/>
+      </w:rPr>
       <w:t>2</w:t>
+    </w:r>
+    <w:r>
+      <w:rPr>
+        <w:sz w:val="18"/>
+        <w:szCs w:val="18"/>
+        <w:rFonts w:ascii="Calibri" w:hAnsi="Calibri"/>
+      </w:rPr>
+      <w:fldChar w:fldCharType="end"/>
+    </w:r>
+    <w:r>
+      <w:rPr>
+        <w:rFonts w:ascii="Calibri" w:hAnsi="Calibri" w:asciiTheme="minorHAnsi" w:hAnsiTheme="minorHAnsi"/>
+        <w:sz w:val="18"/>
+        <w:szCs w:val="18"/>
+      </w:rPr>
+      <w:tab/>
+      <w:t>{{ caseType }} – {{ caseId }}</w:t>
+    </w:r>
+  </w:p>
+</w:ftr>
+</file>
+
+<file path=word/footer3.xml><?xml version="1.0" encoding="utf-8"?>
+<w:ftr xmlns:o="urn:schemas-microsoft-com:office:office" xmlns:r="http://schemas.openxmlformats.org/officeDocument/2006/relationships" xmlns:v="urn:schemas-microsoft-com:vml" xmlns:w="http://schemas.openxmlformats.org/wordprocessingml/2006/main" xmlns:w10="urn:schemas-microsoft-com:office:word" xmlns:wp="http://schemas.openxmlformats.org/drawingml/2006/wordprocessingDrawing" xmlns:wps="http://schemas.microsoft.com/office/word/2010/wordprocessingShape" xmlns:wpg="http://schemas.microsoft.com/office/word/2010/wordprocessingGroup" xmlns:mc="http://schemas.openxmlformats.org/markup-compatibility/2006" xmlns:wp14="http://schemas.microsoft.com/office/word/2010/wordprocessingDrawing" xmlns:w14="http://schemas.microsoft.com/office/word/2010/wordml" xmlns:w15="http://schemas.microsoft.com/office/word/2012/wordml" mc:Ignorable="w14 wp14 w15">
+  <w:p>
+    <w:pPr>
+      <w:pStyle w:val="Footer"/>
+      <w:tabs>
+        <w:tab w:val="center" w:pos="4536" w:leader="none"/>
+        <w:tab w:val="right" w:pos="8931" w:leader="none"/>
+        <w:tab w:val="right" w:pos="9072" w:leader="none"/>
+      </w:tabs>
+      <w:rPr/>
+    </w:pPr>
+    <w:r>
+      <w:rPr>
+        <w:rFonts w:ascii="Calibri" w:hAnsi="Calibri"/>
+        <w:sz w:val="18"/>
+        <w:szCs w:val="18"/>
+      </w:rPr>
+      <w:fldChar w:fldCharType="begin"/>
+    </w:r>
+    <w:r>
+      <w:rPr>
+        <w:sz w:val="18"/>
+        <w:szCs w:val="18"/>
+        <w:rFonts w:ascii="Calibri" w:hAnsi="Calibri"/>
+      </w:rPr>
+      <w:instrText xml:space="preserve"> PAGE </w:instrText>
+    </w:r>
+    <w:r>
+      <w:rPr>
+        <w:sz w:val="18"/>
+        <w:szCs w:val="18"/>
+        <w:rFonts w:ascii="Calibri" w:hAnsi="Calibri"/>
+      </w:rPr>
+      <w:fldChar w:fldCharType="separate"/>
+    </w:r>
+    <w:r>
+      <w:rPr>
+        <w:sz w:val="18"/>
+        <w:szCs w:val="18"/>
+        <w:rFonts w:ascii="Calibri" w:hAnsi="Calibri"/>
+      </w:rPr>
+      <w:t>1</w:t>
     </w:r>
     <w:r>
       <w:rPr>
@@ -3103,6 +3402,20 @@
     </w:pPr>
     <w:r>
       <w:rPr/>
+    </w:r>
+  </w:p>
+</w:hdr>
+</file>
+
+<file path=word/header2.xml><?xml version="1.0" encoding="utf-8"?>
+<w:hdr xmlns:o="urn:schemas-microsoft-com:office:office" xmlns:r="http://schemas.openxmlformats.org/officeDocument/2006/relationships" xmlns:v="urn:schemas-microsoft-com:vml" xmlns:w="http://schemas.openxmlformats.org/wordprocessingml/2006/main" xmlns:w10="urn:schemas-microsoft-com:office:word" xmlns:wp="http://schemas.openxmlformats.org/drawingml/2006/wordprocessingDrawing" xmlns:wps="http://schemas.microsoft.com/office/word/2010/wordprocessingShape" xmlns:wpg="http://schemas.microsoft.com/office/word/2010/wordprocessingGroup" xmlns:mc="http://schemas.openxmlformats.org/markup-compatibility/2006" xmlns:wp14="http://schemas.microsoft.com/office/word/2010/wordprocessingDrawing" xmlns:w14="http://schemas.microsoft.com/office/word/2010/wordml" xmlns:w15="http://schemas.microsoft.com/office/word/2012/wordml" mc:Ignorable="w14 wp14 w15">
+  <w:p>
+    <w:pPr>
+      <w:pStyle w:val="Header"/>
+      <w:rPr/>
+    </w:pPr>
+    <w:r>
+      <w:rPr/>
       <w:drawing>
         <wp:anchor behindDoc="1" distT="0" distB="0" distL="114300" distR="114300" simplePos="0" locked="0" layoutInCell="0" allowOverlap="1" relativeHeight="6">
           <wp:simplePos x="0" y="0"/>
@@ -3124,6 +3437,65 @@
               <pic:pic xmlns:pic="http://schemas.openxmlformats.org/drawingml/2006/picture">
                 <pic:nvPicPr>
                   <pic:cNvPr id="5" name="Grafik 23" descr="C:\Users\Dominique Mäder\Downloads\Florian\kanton-bern-logo.png"/>
+                  <pic:cNvPicPr>
+                    <a:picLocks noChangeAspect="1" noChangeArrowheads="1"/>
+                  </pic:cNvPicPr>
+                </pic:nvPicPr>
+                <pic:blipFill>
+                  <a:blip r:embed="rId1"/>
+                  <a:stretch>
+                    <a:fillRect/>
+                  </a:stretch>
+                </pic:blipFill>
+                <pic:spPr bwMode="auto">
+                  <a:xfrm>
+                    <a:off x="0" y="0"/>
+                    <a:ext cx="545465" cy="689610"/>
+                  </a:xfrm>
+                  <a:prstGeom prst="rect">
+                    <a:avLst/>
+                  </a:prstGeom>
+                </pic:spPr>
+              </pic:pic>
+            </a:graphicData>
+          </a:graphic>
+        </wp:anchor>
+      </w:drawing>
+    </w:r>
+  </w:p>
+</w:hdr>
+</file>
+
+<file path=word/header3.xml><?xml version="1.0" encoding="utf-8"?>
+<w:hdr xmlns:o="urn:schemas-microsoft-com:office:office" xmlns:r="http://schemas.openxmlformats.org/officeDocument/2006/relationships" xmlns:v="urn:schemas-microsoft-com:vml" xmlns:w="http://schemas.openxmlformats.org/wordprocessingml/2006/main" xmlns:w10="urn:schemas-microsoft-com:office:word" xmlns:wp="http://schemas.openxmlformats.org/drawingml/2006/wordprocessingDrawing" xmlns:wps="http://schemas.microsoft.com/office/word/2010/wordprocessingShape" xmlns:wpg="http://schemas.microsoft.com/office/word/2010/wordprocessingGroup" xmlns:mc="http://schemas.openxmlformats.org/markup-compatibility/2006" xmlns:wp14="http://schemas.microsoft.com/office/word/2010/wordprocessingDrawing" xmlns:w14="http://schemas.microsoft.com/office/word/2010/wordml" xmlns:w15="http://schemas.microsoft.com/office/word/2012/wordml" mc:Ignorable="w14 wp14 w15">
+  <w:p>
+    <w:pPr>
+      <w:pStyle w:val="Header"/>
+      <w:rPr/>
+    </w:pPr>
+    <w:r>
+      <w:rPr/>
+      <w:drawing>
+        <wp:anchor behindDoc="1" distT="0" distB="0" distL="114300" distR="114300" simplePos="0" locked="0" layoutInCell="0" allowOverlap="1" relativeHeight="6">
+          <wp:simplePos x="0" y="0"/>
+          <wp:positionH relativeFrom="column">
+            <wp:posOffset>-808990</wp:posOffset>
+          </wp:positionH>
+          <wp:positionV relativeFrom="paragraph">
+            <wp:posOffset>4756150</wp:posOffset>
+          </wp:positionV>
+          <wp:extent cx="545465" cy="689610"/>
+          <wp:effectExtent l="0" t="0" r="0" b="0"/>
+          <wp:wrapSquare wrapText="bothSides"/>
+          <wp:docPr id="6" name="Grafik 23" descr="C:\Users\Dominique Mäder\Downloads\Florian\kanton-bern-logo.png"/>
+          <wp:cNvGraphicFramePr>
+            <a:graphicFrameLocks xmlns:a="http://schemas.openxmlformats.org/drawingml/2006/main" noChangeAspect="1"/>
+          </wp:cNvGraphicFramePr>
+          <a:graphic xmlns:a="http://schemas.openxmlformats.org/drawingml/2006/main">
+            <a:graphicData uri="http://schemas.openxmlformats.org/drawingml/2006/picture">
+              <pic:pic xmlns:pic="http://schemas.openxmlformats.org/drawingml/2006/picture">
+                <pic:nvPicPr>
+                  <pic:cNvPr id="6" name="Grafik 23" descr="C:\Users\Dominique Mäder\Downloads\Florian\kanton-bern-logo.png"/>
                   <pic:cNvPicPr>
                     <a:picLocks noChangeAspect="1" noChangeArrowheads="1"/>
                   </pic:cNvPicPr>
@@ -4089,7 +4461,7 @@
   <w:style w:type="paragraph" w:styleId="Heading" w:customStyle="1">
     <w:name w:val="Heading"/>
     <w:basedOn w:val="Normal"/>
-    <w:next w:val="TextBody"/>
+    <w:next w:val="BodyText"/>
     <w:qFormat/>
     <w:pPr>
       <w:keepNext w:val="true"/>
@@ -4101,7 +4473,7 @@
       <w:szCs w:val="28"/>
     </w:rPr>
   </w:style>
-  <w:style w:type="paragraph" w:styleId="TextBody">
+  <w:style w:type="paragraph" w:styleId="BodyText">
     <w:name w:val="Body Text"/>
     <w:basedOn w:val="Normal"/>
     <w:pPr>
@@ -4111,7 +4483,7 @@
   </w:style>
   <w:style w:type="paragraph" w:styleId="List">
     <w:name w:val="List"/>
-    <w:basedOn w:val="TextBody"/>
+    <w:basedOn w:val="BodyText"/>
     <w:pPr/>
     <w:rPr/>
   </w:style>
@@ -4124,11 +4496,8 @@
       <w:spacing w:before="120" w:after="120"/>
     </w:pPr>
     <w:rPr>
-      <w:rFonts w:cs="Lohit Devanagari"/>
       <w:i/>
       <w:iCs/>
-      <w:sz w:val="24"/>
-      <w:szCs w:val="24"/>
     </w:rPr>
   </w:style>
   <w:style w:type="paragraph" w:styleId="Index" w:customStyle="1">
@@ -4140,20 +4509,7 @@
     </w:pPr>
     <w:rPr/>
   </w:style>
-  <w:style w:type="paragraph" w:styleId="Caption1">
-    <w:name w:val="caption"/>
-    <w:basedOn w:val="Normal"/>
-    <w:qFormat/>
-    <w:pPr>
-      <w:suppressLineNumbers/>
-      <w:spacing w:before="120" w:after="120"/>
-    </w:pPr>
-    <w:rPr>
-      <w:i/>
-      <w:iCs/>
-    </w:rPr>
-  </w:style>
-  <w:style w:type="paragraph" w:styleId="Berschrift" w:customStyle="1">
+  <w:style w:type="paragraph" w:styleId="berschrift" w:customStyle="1">
     <w:name w:val="Überschrift"/>
     <w:basedOn w:val="Normal"/>
     <w:qFormat/>
@@ -4187,7 +4543,7 @@
   </w:style>
   <w:style w:type="paragraph" w:styleId="Title">
     <w:name w:val="Title"/>
-    <w:basedOn w:val="Berschrift"/>
+    <w:basedOn w:val="berschrift"/>
     <w:qFormat/>
     <w:pPr>
       <w:keepNext w:val="false"/>
@@ -4195,7 +4551,7 @@
       <w:suppressAutoHyphens w:val="true"/>
       <w:bidi w:val="0"/>
       <w:spacing w:before="240" w:after="1440"/>
-      <w:ind w:left="4140" w:right="0" w:hanging="0"/>
+      <w:ind w:hanging="0" w:left="4140" w:right="0"/>
       <w:jc w:val="left"/>
     </w:pPr>
     <w:rPr>
@@ -4274,7 +4630,7 @@
     <w:rsid w:val="00636a28"/>
     <w:pPr>
       <w:spacing w:before="0" w:after="0"/>
-      <w:ind w:left="720" w:hanging="0"/>
+      <w:ind w:hanging="0" w:left="720"/>
       <w:contextualSpacing/>
     </w:pPr>
     <w:rPr>
@@ -4294,7 +4650,7 @@
   <w:style w:type="paragraph" w:styleId="Subtitle">
     <w:name w:val="Subtitle"/>
     <w:basedOn w:val="Heading"/>
-    <w:next w:val="TextBody"/>
+    <w:next w:val="BodyText"/>
     <w:qFormat/>
     <w:pPr>
       <w:spacing w:before="60" w:after="120"/>
@@ -4346,41 +4702,41 @@
 </file>
 
 <file path=word/theme/theme1.xml><?xml version="1.0" encoding="utf-8"?>
-<a:theme xmlns:a="http://schemas.openxmlformats.org/drawingml/2006/main" name="Larissa">
+<a:theme xmlns:a="http://schemas.openxmlformats.org/drawingml/2006/main" xmlns:r="http://schemas.openxmlformats.org/officeDocument/2006/relationships" name="Larissa">
   <a:themeElements>
     <a:clrScheme name="Larissa">
       <a:dk1>
-        <a:sysClr val="windowText" lastClr="000000"/>
+        <a:srgbClr val="000000"/>
       </a:dk1>
       <a:lt1>
-        <a:sysClr val="window" lastClr="FFFFFF"/>
+        <a:srgbClr val="ffffff"/>
       </a:lt1>
       <a:dk2>
-        <a:srgbClr val="1F497D"/>
+        <a:srgbClr val="1f497d"/>
       </a:dk2>
       <a:lt2>
-        <a:srgbClr val="EEECE1"/>
+        <a:srgbClr val="eeece1"/>
       </a:lt2>
       <a:accent1>
-        <a:srgbClr val="4F81BD"/>
+        <a:srgbClr val="4f81bd"/>
       </a:accent1>
       <a:accent2>
-        <a:srgbClr val="C0504D"/>
+        <a:srgbClr val="c0504d"/>
       </a:accent2>
       <a:accent3>
-        <a:srgbClr val="9BBB59"/>
+        <a:srgbClr val="9bbb59"/>
       </a:accent3>
       <a:accent4>
-        <a:srgbClr val="8064A2"/>
+        <a:srgbClr val="8064a2"/>
       </a:accent4>
       <a:accent5>
-        <a:srgbClr val="4BACC6"/>
+        <a:srgbClr val="4bacc6"/>
       </a:accent5>
       <a:accent6>
-        <a:srgbClr val="F79646"/>
+        <a:srgbClr val="f79646"/>
       </a:accent6>
       <a:hlink>
-        <a:srgbClr val="0000FF"/>
+        <a:srgbClr val="0000ff"/>
       </a:hlink>
       <a:folHlink>
         <a:srgbClr val="800080"/>
@@ -4388,245 +4744,135 @@
     </a:clrScheme>
     <a:fontScheme name="Larissa">
       <a:majorFont>
-        <a:latin typeface="Cambria"/>
+        <a:latin typeface="Cambria" pitchFamily="0" charset="1"/>
         <a:ea typeface=""/>
         <a:cs typeface=""/>
-        <a:font script="Jpan" typeface="ＭＳ ゴシック"/>
-        <a:font script="Hang" typeface="맑은 고딕"/>
-        <a:font script="Hans" typeface="宋体"/>
-        <a:font script="Hant" typeface="新細明體"/>
-        <a:font script="Arab" typeface="Times New Roman"/>
-        <a:font script="Hebr" typeface="Times New Roman"/>
-        <a:font script="Thai" typeface="Angsana New"/>
-        <a:font script="Ethi" typeface="Nyala"/>
-        <a:font script="Beng" typeface="Vrinda"/>
-        <a:font script="Gujr" typeface="Shruti"/>
-        <a:font script="Khmr" typeface="MoolBoran"/>
-        <a:font script="Knda" typeface="Tunga"/>
-        <a:font script="Guru" typeface="Raavi"/>
-        <a:font script="Cans" typeface="Euphemia"/>
-        <a:font script="Cher" typeface="Plantagenet Cherokee"/>
-        <a:font script="Yiii" typeface="Microsoft Yi Baiti"/>
-        <a:font script="Tibt" typeface="Microsoft Himalaya"/>
-        <a:font script="Thaa" typeface="MV Boli"/>
-        <a:font script="Deva" typeface="Mangal"/>
-        <a:font script="Telu" typeface="Gautami"/>
-        <a:font script="Taml" typeface="Latha"/>
-        <a:font script="Syrc" typeface="Estrangelo Edessa"/>
-        <a:font script="Orya" typeface="Kalinga"/>
-        <a:font script="Mlym" typeface="Kartika"/>
-        <a:font script="Laoo" typeface="DokChampa"/>
-        <a:font script="Sinh" typeface="Iskoola Pota"/>
-        <a:font script="Mong" typeface="Mongolian Baiti"/>
-        <a:font script="Viet" typeface="Times New Roman"/>
-        <a:font script="Uigh" typeface="Microsoft Uighur"/>
-        <a:font script="Geor" typeface="Sylfaen"/>
       </a:majorFont>
       <a:minorFont>
-        <a:latin typeface="Calibri"/>
+        <a:latin typeface="Calibri" pitchFamily="0" charset="1"/>
         <a:ea typeface=""/>
         <a:cs typeface=""/>
-        <a:font script="Jpan" typeface="ＭＳ 明朝"/>
-        <a:font script="Hang" typeface="맑은 고딕"/>
-        <a:font script="Hans" typeface="宋体"/>
-        <a:font script="Hant" typeface="新細明體"/>
-        <a:font script="Arab" typeface="Arial"/>
-        <a:font script="Hebr" typeface="Arial"/>
-        <a:font script="Thai" typeface="Cordia New"/>
-        <a:font script="Ethi" typeface="Nyala"/>
-        <a:font script="Beng" typeface="Vrinda"/>
-        <a:font script="Gujr" typeface="Shruti"/>
-        <a:font script="Khmr" typeface="DaunPenh"/>
-        <a:font script="Knda" typeface="Tunga"/>
-        <a:font script="Guru" typeface="Raavi"/>
-        <a:font script="Cans" typeface="Euphemia"/>
-        <a:font script="Cher" typeface="Plantagenet Cherokee"/>
-        <a:font script="Yiii" typeface="Microsoft Yi Baiti"/>
-        <a:font script="Tibt" typeface="Microsoft Himalaya"/>
-        <a:font script="Thaa" typeface="MV Boli"/>
-        <a:font script="Deva" typeface="Mangal"/>
-        <a:font script="Telu" typeface="Gautami"/>
-        <a:font script="Taml" typeface="Latha"/>
-        <a:font script="Syrc" typeface="Estrangelo Edessa"/>
-        <a:font script="Orya" typeface="Kalinga"/>
-        <a:font script="Mlym" typeface="Kartika"/>
-        <a:font script="Laoo" typeface="DokChampa"/>
-        <a:font script="Sinh" typeface="Iskoola Pota"/>
-        <a:font script="Mong" typeface="Mongolian Baiti"/>
-        <a:font script="Viet" typeface="Arial"/>
-        <a:font script="Uigh" typeface="Microsoft Uighur"/>
-        <a:font script="Geor" typeface="Sylfaen"/>
       </a:minorFont>
     </a:fontScheme>
-    <a:fmtScheme name="Larissa">
+    <a:fmtScheme>
       <a:fillStyleLst>
         <a:solidFill>
           <a:schemeClr val="phClr"/>
         </a:solidFill>
-        <a:gradFill rotWithShape="1">
+        <a:gradFill>
           <a:gsLst>
             <a:gs pos="0">
               <a:schemeClr val="phClr">
                 <a:tint val="50000"/>
-                <a:satMod val="300000"/>
               </a:schemeClr>
             </a:gs>
             <a:gs pos="35000">
               <a:schemeClr val="phClr">
                 <a:tint val="37000"/>
-                <a:satMod val="300000"/>
               </a:schemeClr>
             </a:gs>
             <a:gs pos="100000">
               <a:schemeClr val="phClr">
                 <a:tint val="15000"/>
-                <a:satMod val="350000"/>
               </a:schemeClr>
             </a:gs>
           </a:gsLst>
           <a:lin ang="16200000" scaled="1"/>
+          <a:tileRect l="0" t="0" r="0" b="0"/>
         </a:gradFill>
-        <a:gradFill rotWithShape="1">
+        <a:gradFill>
           <a:gsLst>
             <a:gs pos="0">
               <a:schemeClr val="phClr">
                 <a:shade val="51000"/>
-                <a:satMod val="130000"/>
               </a:schemeClr>
             </a:gs>
             <a:gs pos="80000">
               <a:schemeClr val="phClr">
                 <a:shade val="93000"/>
-                <a:satMod val="130000"/>
               </a:schemeClr>
             </a:gs>
             <a:gs pos="100000">
               <a:schemeClr val="phClr">
                 <a:shade val="94000"/>
-                <a:satMod val="135000"/>
               </a:schemeClr>
             </a:gs>
           </a:gsLst>
           <a:lin ang="16200000" scaled="0"/>
+          <a:tileRect l="0" t="0" r="0" b="0"/>
         </a:gradFill>
       </a:fillStyleLst>
       <a:lnStyleLst>
         <a:ln w="9525" cap="flat" cmpd="sng" algn="ctr">
-          <a:solidFill>
-            <a:schemeClr val="phClr">
-              <a:shade val="95000"/>
-              <a:satMod val="105000"/>
-            </a:schemeClr>
-          </a:solidFill>
           <a:prstDash val="solid"/>
         </a:ln>
         <a:ln w="25400" cap="flat" cmpd="sng" algn="ctr">
-          <a:solidFill>
-            <a:schemeClr val="phClr"/>
-          </a:solidFill>
           <a:prstDash val="solid"/>
         </a:ln>
         <a:ln w="38100" cap="flat" cmpd="sng" algn="ctr">
-          <a:solidFill>
-            <a:schemeClr val="phClr"/>
-          </a:solidFill>
           <a:prstDash val="solid"/>
         </a:ln>
       </a:lnStyleLst>
       <a:effectStyleLst>
         <a:effectStyle>
-          <a:effectLst>
-            <a:outerShdw blurRad="40000" dist="20000" dir="5400000" rotWithShape="0">
-              <a:srgbClr val="000000">
-                <a:alpha val="38000"/>
-              </a:srgbClr>
-            </a:outerShdw>
-          </a:effectLst>
+          <a:effectLst/>
         </a:effectStyle>
         <a:effectStyle>
-          <a:effectLst>
-            <a:outerShdw blurRad="40000" dist="23000" dir="5400000" rotWithShape="0">
-              <a:srgbClr val="000000">
-                <a:alpha val="35000"/>
-              </a:srgbClr>
-            </a:outerShdw>
-          </a:effectLst>
+          <a:effectLst/>
         </a:effectStyle>
         <a:effectStyle>
-          <a:effectLst>
-            <a:outerShdw blurRad="40000" dist="23000" dir="5400000" rotWithShape="0">
-              <a:srgbClr val="000000">
-                <a:alpha val="35000"/>
-              </a:srgbClr>
-            </a:outerShdw>
-          </a:effectLst>
-          <a:scene3d>
-            <a:camera prst="orthographicFront">
-              <a:rot lat="0" lon="0" rev="0"/>
-            </a:camera>
-            <a:lightRig rig="threePt" dir="t">
-              <a:rot lat="0" lon="0" rev="1200000"/>
-            </a:lightRig>
-          </a:scene3d>
-          <a:sp3d>
-            <a:bevelT w="63500" h="25400"/>
-          </a:sp3d>
+          <a:effectLst/>
         </a:effectStyle>
       </a:effectStyleLst>
       <a:bgFillStyleLst>
         <a:solidFill>
           <a:schemeClr val="phClr"/>
         </a:solidFill>
-        <a:gradFill rotWithShape="1">
+        <a:gradFill>
           <a:gsLst>
             <a:gs pos="0">
               <a:schemeClr val="phClr">
                 <a:tint val="40000"/>
-                <a:satMod val="350000"/>
               </a:schemeClr>
             </a:gs>
             <a:gs pos="40000">
               <a:schemeClr val="phClr">
                 <a:tint val="45000"/>
                 <a:shade val="99000"/>
-                <a:satMod val="350000"/>
               </a:schemeClr>
             </a:gs>
             <a:gs pos="100000">
               <a:schemeClr val="phClr">
                 <a:shade val="20000"/>
-                <a:satMod val="255000"/>
               </a:schemeClr>
             </a:gs>
           </a:gsLst>
           <a:path path="circle">
             <a:fillToRect l="50000" t="-80000" r="50000" b="180000"/>
           </a:path>
+          <a:tileRect l="0" t="0" r="0" b="0"/>
         </a:gradFill>
-        <a:gradFill rotWithShape="1">
+        <a:gradFill>
           <a:gsLst>
             <a:gs pos="0">
               <a:schemeClr val="phClr">
                 <a:tint val="80000"/>
-                <a:satMod val="300000"/>
               </a:schemeClr>
             </a:gs>
             <a:gs pos="100000">
               <a:schemeClr val="phClr">
                 <a:shade val="30000"/>
-                <a:satMod val="200000"/>
               </a:schemeClr>
             </a:gs>
           </a:gsLst>
           <a:path path="circle">
             <a:fillToRect l="50000" t="50000" r="50000" b="50000"/>
           </a:path>
+          <a:tileRect l="0" t="0" r="0" b="0"/>
         </a:gradFill>
       </a:bgFillStyleLst>
     </a:fmtScheme>
   </a:themeElements>
-  <a:objectDefaults/>
-  <a:extraClrSchemeLst/>
 </a:theme>
 </file>
 

</xml_diff>